<commit_message>
Add corresponding author to SIBR 2027 abstract
Co-Authored-By: Claude Opus 5.5 <noreply@anthropic.com>
Claude-Session: https://claude.ai/code/session_011DPP86EDbCqQune5y6VNAv
</commit_message>
<xml_diff>
--- a/output/sibr2027_tokyo_abstract_PES.docx
+++ b/output/sibr2027_tokyo_abstract_PES.docx
@@ -259,25 +259,23 @@
           <w:szCs w:val="20"/>
           <w:lang w:eastAsia="zh-HK"/>
         </w:rPr>
-        <w:t>Second Author</w:t>
-      </w:r>
-      <w:r>
-        <w:rPr>
-          <w:rFonts w:cs="Times New Roman" w:ascii="Times New Roman" w:hAnsi="Times New Roman"/>
-          <w:iCs/>
-          <w:szCs w:val="20"/>
-          <w:lang w:eastAsia="zh-HK"/>
-        </w:rPr>
-        <w:t>’</w:t>
-      </w:r>
-      <w:r>
-        <w:rPr>
-          <w:rFonts w:cs="Times New Roman" w:ascii="Times New Roman" w:hAnsi="Times New Roman"/>
-          <w:iCs/>
-          <w:szCs w:val="20"/>
-          <w:lang w:eastAsia="zh-HK"/>
-        </w:rPr>
-        <w:t>s Name</w:t>
+        <w:t>Youngmin Lee*</w:t>
+      </w:r>
+      <w:r>
+        <w:rPr>
+          <w:rFonts w:cs="Times New Roman" w:ascii="Times New Roman" w:hAnsi="Times New Roman"/>
+          <w:iCs/>
+          <w:szCs w:val="20"/>
+          <w:lang w:eastAsia="zh-HK"/>
+        </w:rPr>
+      </w:r>
+      <w:r>
+        <w:rPr>
+          <w:rFonts w:cs="Times New Roman" w:ascii="Times New Roman" w:hAnsi="Times New Roman"/>
+          <w:iCs/>
+          <w:szCs w:val="20"/>
+          <w:lang w:eastAsia="zh-HK"/>
+        </w:rPr>
       </w:r>
     </w:p>
     <w:p>
@@ -296,75 +294,70 @@
           <w:szCs w:val="20"/>
           <w:lang w:eastAsia="zh-HK"/>
         </w:rPr>
-        <w:t>Second Author</w:t>
-      </w:r>
-      <w:r>
-        <w:rPr>
-          <w:rFonts w:cs="Times New Roman" w:ascii="Times New Roman" w:hAnsi="Times New Roman"/>
-          <w:iCs/>
-          <w:szCs w:val="20"/>
-          <w:lang w:eastAsia="zh-HK"/>
-        </w:rPr>
-        <w:t>’</w:t>
-      </w:r>
-      <w:r>
-        <w:rPr>
-          <w:rFonts w:cs="Times New Roman" w:ascii="Times New Roman" w:hAnsi="Times New Roman"/>
-          <w:iCs/>
-          <w:szCs w:val="20"/>
-          <w:lang w:eastAsia="zh-HK"/>
-        </w:rPr>
-        <w:t>s Affiliation</w:t>
-      </w:r>
-      <w:r>
-        <w:rPr>
-          <w:rFonts w:cs="Times New Roman" w:ascii="Times New Roman" w:hAnsi="Times New Roman"/>
-          <w:iCs/>
-          <w:szCs w:val="20"/>
-        </w:rPr>
-        <w:t xml:space="preserve"> </w:t>
-      </w:r>
-    </w:p>
-    <w:p>
-      <w:pPr>
-        <w:pStyle w:val="NormalWeb"/>
-        <w:snapToGrid w:val="false"/>
-        <w:spacing w:before="0" w:after="0"/>
-        <w:jc w:val="center"/>
-        <w:textAlignment w:val="top"/>
-        <w:rPr>
-          <w:rFonts w:ascii="Times New Roman" w:hAnsi="Times New Roman" w:cs="Times New Roman"/>
-          <w:iCs/>
-          <w:szCs w:val="20"/>
-          <w:lang w:eastAsia="zh-HK"/>
-        </w:rPr>
-      </w:pPr>
-      <w:r>
-        <w:rPr>
-          <w:rFonts w:cs="Times New Roman" w:ascii="Times New Roman" w:hAnsi="Times New Roman"/>
-          <w:iCs/>
-          <w:szCs w:val="20"/>
-          <w:lang w:eastAsia="zh-HK"/>
-        </w:rPr>
-        <w:t>Second Author</w:t>
-      </w:r>
-      <w:r>
-        <w:rPr>
-          <w:rFonts w:cs="Times New Roman" w:ascii="Times New Roman" w:hAnsi="Times New Roman"/>
-          <w:iCs/>
-          <w:szCs w:val="20"/>
-          <w:lang w:eastAsia="zh-HK"/>
-        </w:rPr>
-        <w:t>’</w:t>
-      </w:r>
-      <w:r>
-        <w:rPr>
-          <w:rFonts w:cs="Times New Roman" w:ascii="Times New Roman" w:hAnsi="Times New Roman"/>
-          <w:iCs/>
-          <w:szCs w:val="20"/>
-          <w:lang w:eastAsia="zh-HK"/>
-        </w:rPr>
-        <w:t>s email address</w:t>
+        <w:t>Graduate School, Sookmyung Women’s University, Seoul, Korea</w:t>
+      </w:r>
+      <w:r>
+        <w:rPr>
+          <w:rFonts w:cs="Times New Roman" w:ascii="Times New Roman" w:hAnsi="Times New Roman"/>
+          <w:iCs/>
+          <w:szCs w:val="20"/>
+          <w:lang w:eastAsia="zh-HK"/>
+        </w:rPr>
+      </w:r>
+      <w:r>
+        <w:rPr>
+          <w:rFonts w:cs="Times New Roman" w:ascii="Times New Roman" w:hAnsi="Times New Roman"/>
+          <w:iCs/>
+          <w:szCs w:val="20"/>
+          <w:lang w:eastAsia="zh-HK"/>
+        </w:rPr>
+      </w:r>
+      <w:r>
+        <w:rPr>
+          <w:rFonts w:cs="Times New Roman" w:ascii="Times New Roman" w:hAnsi="Times New Roman"/>
+          <w:iCs/>
+          <w:szCs w:val="20"/>
+        </w:rPr>
+      </w:r>
+    </w:p>
+    <w:p>
+      <w:pPr>
+        <w:pStyle w:val="NormalWeb"/>
+        <w:snapToGrid w:val="false"/>
+        <w:spacing w:before="0" w:after="0"/>
+        <w:jc w:val="center"/>
+        <w:textAlignment w:val="top"/>
+        <w:rPr>
+          <w:rFonts w:ascii="Times New Roman" w:hAnsi="Times New Roman" w:cs="Times New Roman"/>
+          <w:iCs/>
+          <w:szCs w:val="20"/>
+          <w:lang w:eastAsia="zh-HK"/>
+        </w:rPr>
+      </w:pPr>
+      <w:r>
+        <w:rPr>
+          <w:rFonts w:cs="Times New Roman" w:ascii="Times New Roman" w:hAnsi="Times New Roman"/>
+          <w:iCs/>
+          <w:szCs w:val="20"/>
+          <w:lang w:eastAsia="zh-HK"/>
+        </w:rPr>
+        <w:t>[Corresponding author’s email address]</w:t>
+      </w:r>
+      <w:r>
+        <w:rPr>
+          <w:rFonts w:cs="Times New Roman" w:ascii="Times New Roman" w:hAnsi="Times New Roman"/>
+          <w:iCs/>
+          <w:szCs w:val="20"/>
+          <w:lang w:eastAsia="zh-HK"/>
+        </w:rPr>
+      </w:r>
+      <w:r>
+        <w:rPr>
+          <w:rFonts w:cs="Times New Roman" w:ascii="Times New Roman" w:hAnsi="Times New Roman"/>
+          <w:iCs/>
+          <w:szCs w:val="20"/>
+          <w:lang w:eastAsia="zh-HK"/>
+        </w:rPr>
       </w:r>
     </w:p>
     <w:p>

</xml_diff>